<commit_message>
docs: atualizar manual, artigo e README com funcionalidades recentes
Acrescenta nas documentações existentes (sem criar versões paralelas):
- Geofence auto-checkout: GeofenceWatcher, /api/clock/auto-out, notificação de atividades pendentes
- Sino de notificações em todas as páginas do estagiário (/dashboard, /history, /profile)
- Níveis e ranking proporcionais à duração do curso (course_duration_years)
- course_duration_years preenchido automaticamente ao selecionar o curso
- /api/intern/notifications documentado como rota dedicada às notificações
- Seção 14.6 no manual: guia de manutenção do geofence auto-checkout

Co-Authored-By: Claude Sonnet 4.6 <noreply@anthropic.com>
</commit_message>
<xml_diff>
--- a/Milton/ARTIGO.docx
+++ b/Milton/ARTIGO.docx
@@ -1442,7 +1442,7 @@
           <w:sz w:val="22"/>
           <w:szCs w:val="22"/>
         </w:rPr>
-        <w:t xml:space="preserve">3.3.1 Registro de Ponto com Geolocalização</w:t>
+        <w:t xml:space="preserve">3.3.1 Registro de Ponto com Geolocalização e Auto-Checkout</w:t>
       </w:r>
     </w:p>
     <w:p>
@@ -1483,6 +1483,26 @@
           <w:szCs w:val="22"/>
         </w:rPr>
         <w:t xml:space="preserve">A isenção de validação GPS pode ser ativada individualmente por estagiário (campo geo_exempt na tabela profiles), permitindo registros remotos para casos específicos. O timestamp de todos os registros é gerado pelo servidor, impedindo manipulação pelo cliente.</w:t>
+      </w:r>
+    </w:p>
+    <w:p>
+      <w:pPr>
+        <w:spacing w:after="80" w:before="80" w:line="360"/>
+        <w:ind w:firstLine="720"/>
+        <w:jc w:val="both"/>
+      </w:pPr>
+      <w:r>
+        <w:rPr>
+          <w:rFonts w:ascii="Times New Roman" w:cs="Times New Roman" w:eastAsia="Times New Roman" w:hAnsi="Times New Roman"/>
+          <w:b w:val="false"/>
+          <w:bCs w:val="false"/>
+          <w:i w:val="false"/>
+          <w:iCs w:val="false"/>
+          <w:color w:val="1a1a1a"/>
+          <w:sz w:val="22"/>
+          <w:szCs w:val="22"/>
+        </w:rPr>
+        <w:t xml:space="preserve">Para cobrir o caso em que o estagiário sai do laboratório sem registrar a saída, o sistema implementa geofence auto-checkout: o componente GeofenceWatcher monitora continuamente a posição via watchPosition e, ao detectar distância superior a 200 m, chama automaticamente a rota /api/clock/auto-out para fechar o registro. O estagiário é notificado pelo sino de notificações para registrar as atividades pendentes. Estagiários isentos de geolocalização não são monitorados.</w:t>
       </w:r>
     </w:p>
     <w:p>
@@ -1757,7 +1777,7 @@
           <w:sz w:val="22"/>
           <w:szCs w:val="22"/>
         </w:rPr>
-        <w:t xml:space="preserve">Registro de ponto com validação geográfica e timestamp servidor-autoritativo</w:t>
+        <w:t xml:space="preserve">Registro de ponto com validação geográfica (Haversine) e timestamp servidor-autoritativo</w:t>
       </w:r>
     </w:p>
     <w:p>
@@ -1780,7 +1800,7 @@
           <w:sz w:val="22"/>
           <w:szCs w:val="22"/>
         </w:rPr>
-        <w:t xml:space="preserve">Documentação de atividades com correção ortográfica automática Hunspell PT-BR</w:t>
+        <w:t xml:space="preserve">Geofence auto-checkout: encerramento automático ao sair do raio do laboratório com notificação de atividades pendentes</w:t>
       </w:r>
     </w:p>
     <w:p>
@@ -1803,7 +1823,7 @@
           <w:sz w:val="22"/>
           <w:szCs w:val="22"/>
         </w:rPr>
-        <w:t xml:space="preserve">Gamificação com pontos, 6 níveis, 15 conquistas e ranking entre estagiários</w:t>
+        <w:t xml:space="preserve">Documentação de atividades com correção ortográfica automática Hunspell PT-BR</w:t>
       </w:r>
     </w:p>
     <w:p>
@@ -1826,7 +1846,7 @@
           <w:sz w:val="22"/>
           <w:szCs w:val="22"/>
         </w:rPr>
-        <w:t xml:space="preserve">14 tipos de relatório em PDF gerados no servidor com @react-pdf/renderer</w:t>
+        <w:t xml:space="preserve">Gamificação com pontos, 6 níveis proporcionais à duração do curso, 15 conquistas e ranking</w:t>
       </w:r>
     </w:p>
     <w:p>
@@ -1849,7 +1869,53 @@
           <w:sz w:val="22"/>
           <w:szCs w:val="22"/>
         </w:rPr>
+        <w:t xml:space="preserve">14 tipos de relatório em PDF gerados no servidor com @react-pdf/renderer</w:t>
+      </w:r>
+    </w:p>
+    <w:p>
+      <w:pPr>
+        <w:pStyle w:val="ListParagraph"/>
+        <w:numPr>
+          <w:ilvl w:val="0"/>
+          <w:numId w:val="2"/>
+        </w:numPr>
+        <w:spacing w:after="40" w:before="40"/>
+      </w:pPr>
+      <w:r>
+        <w:rPr>
+          <w:rFonts w:ascii="Times New Roman" w:cs="Times New Roman" w:eastAsia="Times New Roman" w:hAnsi="Times New Roman"/>
+          <w:b w:val="false"/>
+          <w:bCs w:val="false"/>
+          <w:i w:val="false"/>
+          <w:iCs w:val="false"/>
+          <w:color w:val="1a1a1a"/>
+          <w:sz w:val="22"/>
+          <w:szCs w:val="22"/>
+        </w:rPr>
         <w:t xml:space="preserve">Tour de onboarding interativo com slides e tooltips guiados</w:t>
+      </w:r>
+    </w:p>
+    <w:p>
+      <w:pPr>
+        <w:pStyle w:val="ListParagraph"/>
+        <w:numPr>
+          <w:ilvl w:val="0"/>
+          <w:numId w:val="2"/>
+        </w:numPr>
+        <w:spacing w:after="40" w:before="40"/>
+      </w:pPr>
+      <w:r>
+        <w:rPr>
+          <w:rFonts w:ascii="Times New Roman" w:cs="Times New Roman" w:eastAsia="Times New Roman" w:hAnsi="Times New Roman"/>
+          <w:b w:val="false"/>
+          <w:bCs w:val="false"/>
+          <w:i w:val="false"/>
+          <w:iCs w:val="false"/>
+          <w:color w:val="1a1a1a"/>
+          <w:sz w:val="22"/>
+          <w:szCs w:val="22"/>
+        </w:rPr>
+        <w:t xml:space="preserve">Sino de notificações persistentes para estagiários (polling 60 s): ponto em aberto, atividades pendentes, feedbacks, conquistas</w:t>
       </w:r>
     </w:p>
     <w:p>

</xml_diff>